<commit_message>
Rename auto-shift to automatic setting in TZ and OpenSpec
Replace автосдвиг with автоматическая установка in all cases, including the settings register name нп_НастройкиАвтоматическойУстановкиДатЗапрета. Rebuild Word copies of tz.md and the ERP.2026.14 request.

Co-authored-by: an_skripko <an_skripko@vk.com>
</commit_message>
<xml_diff>
--- a/openspec/changes/np-dates-of-prohibition-setup/ERP.2026.14.docx
+++ b/openspec/changes/np-dates-of-prohibition-setup/ERP.2026.14.docx
@@ -191,7 +191,7 @@
           <w:color w:val="000000"/>
           <w:sz w:val="28"/>
         </w:rPr>
-        <w:t xml:space="preserve"> автосдвиг дат запрета изменения и заявка на открытие периода</w:t>
+        <w:t xml:space="preserve"> автоматическая установка дат запрета изменения и заявка на открытие периода</w:t>
       </w:r>
     </w:p>
     <w:p>
@@ -350,7 +350,7 @@
           <w:color w:val="000000"/>
           <w:sz w:val="28"/>
         </w:rPr>
-        <w:t>Автоматически сдвигать абсолютную дату запрета по правилу «сегодня минус N дней» без ежедневной ручной правки типового регистра.</w:t>
+        <w:t>Автоматически устанавливать абсолютную дату запрета по правилу «сегодня минус N дней» без ежедневной ручной правки типового регистра.</w:t>
       </w:r>
     </w:p>
     <w:p>
@@ -421,7 +421,7 @@
           <w:color w:val="000000"/>
           <w:sz w:val="28"/>
         </w:rPr>
-        <w:t>3.1. Автосдвиг дат запрета</w:t>
+        <w:t>3.1. Автоматическая установка дат запрета</w:t>
       </w:r>
     </w:p>
     <w:p>
@@ -438,7 +438,7 @@
           <w:color w:val="000000"/>
           <w:sz w:val="28"/>
         </w:rPr>
-        <w:t xml:space="preserve">Ввести настройки автосдвига (регистр сведений </w:t>
+        <w:t xml:space="preserve">Ввести настройки автоматической установки (регистр сведений </w:t>
       </w:r>
       <w:r>
         <w:rPr>
@@ -448,7 +448,7 @@
           <w:color w:val="000000"/>
           <w:sz w:val="24"/>
         </w:rPr>
-        <w:t>нп_НастройкиАвтосдвигаДатЗапрета</w:t>
+        <w:t>нп_НастройкиАвтоматическойУстановкиДатЗапрета</w:t>
       </w:r>
       <w:r>
         <w:rPr>
@@ -566,7 +566,7 @@
           <w:color w:val="000000"/>
           <w:sz w:val="28"/>
         </w:rPr>
-        <w:t>Изменяются только записи типового регистра, которые есть в настройках автосдвига. Даты, заданные только в типовой форме, не перезаписываются. При пустом разделе не заполняются касса, склады, сценарии и банковские счета.</w:t>
+        <w:t>Изменяются только записи типового регистра, которые есть в настройках автоматической установки. Даты, заданные только в типовой форме, не перезаписываются. При пустом разделе не заполняются касса, склады, сценарии и банковские счета.</w:t>
       </w:r>
     </w:p>
     <w:p>
@@ -708,7 +708,7 @@
           <w:color w:val="000000"/>
           <w:sz w:val="28"/>
         </w:rPr>
-        <w:t>в типовой регистр записывается отсечка «Период с минус 1 день» по организациям, разделу и Пользователям из настроек автосдвига;</w:t>
+        <w:t>в типовой регистр записывается отсечка «Период с минус 1 день» по организациям, разделу и Пользователям из настроек автоматической установки;</w:t>
       </w:r>
     </w:p>
     <w:p>
@@ -752,7 +752,7 @@
           <w:color w:val="000000"/>
           <w:sz w:val="28"/>
         </w:rPr>
-        <w:t>Пока срок действия открытого периода не истёк, автосдвиг эти записи не перезаписывает. После истечения срока при включённом автосдвиге восстанавливается своё «сегодня минус N» каждой настройки.</w:t>
+        <w:t>Пока срок действия открытого периода не истёк, автоматическая установка эти записи не перезаписывает. После истечения срока при включённой автоматической установке восстанавливается своё «сегодня минус N» каждой настройки.</w:t>
       </w:r>
     </w:p>
     <w:p>
@@ -1100,7 +1100,7 @@
           <w:color w:val="000000"/>
           <w:sz w:val="28"/>
         </w:rPr>
-        <w:t>Согласованная заявка временно открывает период на K дней, затем граница возвращается к автосдвигу.</w:t>
+        <w:t>Согласованная заявка временно открывает период на K дней, затем граница возвращается к автоматической установке.</w:t>
       </w:r>
     </w:p>
     <w:p>

</xml_diff>

<commit_message>
Break ERP.2026.14 request into paragraphs and lists
Split the blended requirement text into short paragraphs, numbered lists and bullets, with extra spacing so the Word copy is easier to read.

Co-authored-by: an_skripko <an_skripko@vk.com>
</commit_message>
<xml_diff>
--- a/openspec/changes/np-dates-of-prohibition-setup/ERP.2026.14.docx
+++ b/openspec/changes/np-dates-of-prohibition-setup/ERP.2026.14.docx
@@ -6,7 +6,7 @@
       <w:pPr>
         <w:pStyle w:val="1"/>
         <w:jc w:val="center"/>
-        <w:spacing w:after="0" w:line="360" w:lineRule="auto" w:before="0"/>
+        <w:spacing w:after="200" w:before="0" w:line="360" w:lineRule="auto"/>
       </w:pPr>
       <w:r>
         <w:rPr>
@@ -17,7 +17,7 @@
     </w:p>
     <w:p>
       <w:pPr>
-        <w:spacing w:after="0" w:line="360" w:lineRule="auto"/>
+        <w:spacing w:after="160" w:before="0" w:line="360" w:lineRule="auto"/>
       </w:pPr>
       <w:r>
         <w:rPr>
@@ -30,7 +30,7 @@
     </w:p>
     <w:p>
       <w:pPr>
-        <w:spacing w:after="0" w:line="360" w:lineRule="auto"/>
+        <w:spacing w:after="160" w:before="0" w:line="360" w:lineRule="auto"/>
       </w:pPr>
       <w:r>
         <w:rPr>
@@ -43,7 +43,7 @@
     </w:p>
     <w:p>
       <w:pPr>
-        <w:spacing w:after="0" w:line="360" w:lineRule="auto"/>
+        <w:spacing w:after="160" w:before="0" w:line="360" w:lineRule="auto"/>
       </w:pPr>
       <w:r>
         <w:rPr>
@@ -56,7 +56,7 @@
     </w:p>
     <w:p>
       <w:pPr>
-        <w:spacing w:after="0" w:line="360" w:lineRule="auto"/>
+        <w:spacing w:after="160" w:before="0" w:line="360" w:lineRule="auto"/>
       </w:pPr>
       <w:r>
         <w:rPr>
@@ -69,7 +69,7 @@
     </w:p>
     <w:p>
       <w:pPr>
-        <w:spacing w:after="0" w:line="360" w:lineRule="auto"/>
+        <w:spacing w:after="160" w:before="0" w:line="360" w:lineRule="auto"/>
       </w:pPr>
       <w:r>
         <w:rPr>
@@ -83,7 +83,7 @@
     <w:p>
       <w:pPr>
         <w:pStyle w:val="21"/>
-        <w:spacing w:after="0" w:line="360" w:lineRule="auto" w:before="0"/>
+        <w:spacing w:after="120" w:before="240" w:line="360" w:lineRule="auto"/>
       </w:pPr>
       <w:r>
         <w:rPr>
@@ -94,7 +94,7 @@
     </w:p>
     <w:p>
       <w:pPr>
-        <w:spacing w:after="0" w:line="360" w:lineRule="auto"/>
+        <w:spacing w:after="160" w:before="0" w:line="360" w:lineRule="auto"/>
       </w:pPr>
       <w:r>
         <w:rPr>
@@ -115,7 +115,7 @@
     </w:p>
     <w:p>
       <w:pPr>
-        <w:spacing w:after="0" w:line="360" w:lineRule="auto"/>
+        <w:spacing w:after="160" w:before="0" w:line="360" w:lineRule="auto"/>
       </w:pPr>
       <w:r>
         <w:rPr>
@@ -136,7 +136,7 @@
     </w:p>
     <w:p>
       <w:pPr>
-        <w:spacing w:after="0" w:line="360" w:lineRule="auto"/>
+        <w:spacing w:after="160" w:before="0" w:line="360" w:lineRule="auto"/>
       </w:pPr>
       <w:r>
         <w:rPr>
@@ -146,19 +146,63 @@
         </w:rPr>
         <w:t>Описание текущего процесса и проблемы:</w:t>
       </w:r>
+    </w:p>
+    <w:p>
+      <w:pPr>
+        <w:spacing w:after="160" w:before="0" w:line="360" w:lineRule="auto"/>
+      </w:pPr>
       <w:r>
         <w:rPr>
           <w:b w:val="0"/>
           <w:i w:val="0"/>
           <w:lang w:val="ru-RU"/>
         </w:rPr>
-        <w:t xml:space="preserve"> Типовой механизм БСП «Даты запрета изменения» закрывает период: объекты с датой не позднее установленной границы записывать нельзя. Для организаций граница задаётся абсолютной датой. Эту дату приходится регулярно переносить вручную. Отдельной заявки на временное открытие уже закрытого периода с согласованием в 1С:Документооборот 3 в типовой конфигурации нет. Типовая проверка даты запрета при записи объектов работает и изменяться не должна.</w:t>
+        <w:t>Типовой механизм БСП «Даты запрета изменения» закрывает период: объекты с датой не позднее установленной границы записывать нельзя.</w:t>
       </w:r>
     </w:p>
     <w:p>
       <w:pPr>
+        <w:spacing w:after="160" w:before="0" w:line="360" w:lineRule="auto"/>
+      </w:pPr>
+      <w:r>
+        <w:rPr>
+          <w:b w:val="0"/>
+          <w:i w:val="0"/>
+          <w:lang w:val="ru-RU"/>
+        </w:rPr>
+        <w:t>Для организаций граница задаётся абсолютной датой. Эту дату приходится регулярно переносить вручную.</w:t>
+      </w:r>
+    </w:p>
+    <w:p>
+      <w:pPr>
+        <w:spacing w:after="160" w:before="0" w:line="360" w:lineRule="auto"/>
+      </w:pPr>
+      <w:r>
+        <w:rPr>
+          <w:b w:val="0"/>
+          <w:i w:val="0"/>
+          <w:lang w:val="ru-RU"/>
+        </w:rPr>
+        <w:t>Отдельной заявки на временное открытие уже закрытого периода с согласованием в 1С:Документооборот 3 в типовой конфигурации нет.</w:t>
+      </w:r>
+    </w:p>
+    <w:p>
+      <w:pPr>
+        <w:spacing w:after="160" w:before="0" w:line="360" w:lineRule="auto"/>
+      </w:pPr>
+      <w:r>
+        <w:rPr>
+          <w:b w:val="0"/>
+          <w:i w:val="0"/>
+          <w:lang w:val="ru-RU"/>
+        </w:rPr>
+        <w:t>Типовая проверка даты запрета при записи объектов работает и изменяться не должна.</w:t>
+      </w:r>
+    </w:p>
+    <w:p>
+      <w:pPr>
         <w:pStyle w:val="21"/>
-        <w:spacing w:after="0" w:line="360" w:lineRule="auto" w:before="0"/>
+        <w:spacing w:after="120" w:before="240" w:line="360" w:lineRule="auto"/>
       </w:pPr>
       <w:r>
         <w:rPr>
@@ -169,7 +213,7 @@
     </w:p>
     <w:p>
       <w:pPr>
-        <w:spacing w:after="0" w:line="360" w:lineRule="auto"/>
+        <w:spacing w:after="160" w:before="0" w:line="360" w:lineRule="auto"/>
       </w:pPr>
       <w:r>
         <w:rPr>
@@ -179,18 +223,24 @@
         </w:rPr>
         <w:t>Предлагаемое решение:</w:t>
       </w:r>
+    </w:p>
+    <w:p>
+      <w:pPr>
+        <w:spacing w:after="160" w:before="0" w:line="360" w:lineRule="auto"/>
+      </w:pPr>
       <w:r>
         <w:rPr>
           <w:b w:val="0"/>
           <w:i w:val="0"/>
           <w:lang w:val="ru-RU"/>
         </w:rPr>
-        <w:t xml:space="preserve"> Реализовать в расширении НП автоматическую установку абсолютной даты запрета по правилу «сегодня минус N дней» и документ заявки на временное открытие периода с бесшовным согласованием в 1С:Документооборот 3.</w:t>
+        <w:t>Реализовать в расширении НП:</w:t>
       </w:r>
     </w:p>
     <w:p>
       <w:pPr>
-        <w:spacing w:after="0" w:line="360" w:lineRule="auto"/>
+        <w:spacing w:after="40" w:before="0" w:line="360" w:lineRule="auto"/>
+        <w:ind w:left="567" w:hanging="227"/>
       </w:pPr>
       <w:r>
         <w:rPr>
@@ -198,12 +248,13 @@
           <w:i w:val="0"/>
           <w:lang w:val="ru-RU"/>
         </w:rPr>
-        <w:t>Автоматическая установка. Настройки (регистр сведений нп_НастройкиАвтоматическойУстановкиДатЗапрета): организация, Пользователи (пользователь/группа пользователей), раздел учёта (необязательно), число дней N, признак включения. Пустое значение Пользователи означает «для всех пользователей». Пустой раздел означает все разделы учёта, где объект - организация (бухгалтерский учёт, продажи, международный учёт и аналогичные). Касса, склады, сценарии бюджетирования и банковские счета при пустом разделе не заполняются: у этих разделов объект другой (касса, склад, сценарий, счёт), их даты в типовой форме живут отдельно. Регламентное задание нп_СдвигДатЗапретаИзменения записывает в типовой регистр ДатыЗапретаИзменения абсолютную дату: начало дня текущей даты сеанса минус N дней настройки. Для одной организации допускается несколько настроек с разным N: по Пользователям и, при необходимости, по разделу учёта. Изменяются только записи, которые есть в настройках. Даты, заданные только в типовой форме, не перезаписываются.</w:t>
+        <w:t>- автоматическую установку абсолютной даты запрета по правилу «сегодня минус N дней»;</w:t>
       </w:r>
     </w:p>
     <w:p>
       <w:pPr>
-        <w:spacing w:after="0" w:line="360" w:lineRule="auto"/>
+        <w:spacing w:after="40" w:before="0" w:line="360" w:lineRule="auto"/>
+        <w:ind w:left="567" w:hanging="227"/>
       </w:pPr>
       <w:r>
         <w:rPr>
@@ -211,12 +262,24 @@
           <w:i w:val="0"/>
           <w:lang w:val="ru-RU"/>
         </w:rPr>
-        <w:t>Заявка на открытие периода. Документ нп_ЗаявкаНаОткрытиеПериода: организации, срок действия открытого периода в днях (K), период «с» и «по», раздел учёта (необязательно). Согласование - штатными средствами бесшовной интеграции с 1С:Документооборот 3. Пока заявка не согласована, типовой регистр не изменяется. После состояния «Согласован»: срок действия открытого периода отсчитывается от даты согласования (день согласования - день 1); в типовой регистр записывается отсечка «Период с минус 1 день» по организациям, разделу и Пользователям из настроек автоматической установки; если настроек по организации нет, записывается «для всех пользователей». Пока срок действия открытого периода не истёк, автоматическая установка эти записи не перезаписывает. После истечения срока при включённой автоматической установке восстанавливается своё «сегодня минус N» каждой настройки. На форме заявки нужно пояснение: отсечка БСП откроет всё после даты «Период с минус 1 день», а не только выбранный месяц.</w:t>
+        <w:t>- документ заявки на временное открытие периода с бесшовным согласованием в 1С:Документооборот 3.</w:t>
       </w:r>
     </w:p>
     <w:p>
       <w:pPr>
-        <w:spacing w:after="0" w:line="360" w:lineRule="auto"/>
+        <w:pStyle w:val="31"/>
+        <w:spacing w:after="80" w:before="200" w:line="360" w:lineRule="auto"/>
+      </w:pPr>
+      <w:r>
+        <w:rPr>
+          <w:lang w:val="ru-RU"/>
+        </w:rPr>
+        <w:t>2.1. Автоматическая установка</w:t>
+      </w:r>
+    </w:p>
+    <w:p>
+      <w:pPr>
+        <w:spacing w:after="160" w:before="0" w:line="360" w:lineRule="auto"/>
       </w:pPr>
       <w:r>
         <w:rPr>
@@ -224,13 +287,581 @@
           <w:i w:val="0"/>
           <w:lang w:val="ru-RU"/>
         </w:rPr>
-        <w:t>Не входит в заявку (постоянно): изменение типовых подписок и модулей проверки даты запрета; новый относительный вариант БСП вида «прошло N дней»; открытие только середины закрытого диапазона; правки форм расширения ТН. Отложено: форма бухгалтера без прав на весь типовой регистр; массовая загрузка из Excel.</w:t>
+        <w:t>Настройки ведутся в регистре сведений нп_НастройкиАвтоматическойУстановкиДатЗапрета:</w:t>
       </w:r>
     </w:p>
     <w:p>
       <w:pPr>
+        <w:spacing w:after="40" w:before="0" w:line="360" w:lineRule="auto"/>
+        <w:ind w:left="567" w:hanging="227"/>
+      </w:pPr>
+      <w:r>
+        <w:rPr>
+          <w:b w:val="0"/>
+          <w:i w:val="0"/>
+          <w:lang w:val="ru-RU"/>
+        </w:rPr>
+        <w:t>- организация;</w:t>
+      </w:r>
+    </w:p>
+    <w:p>
+      <w:pPr>
+        <w:spacing w:after="40" w:before="0" w:line="360" w:lineRule="auto"/>
+        <w:ind w:left="567" w:hanging="227"/>
+      </w:pPr>
+      <w:r>
+        <w:rPr>
+          <w:b w:val="0"/>
+          <w:i w:val="0"/>
+          <w:lang w:val="ru-RU"/>
+        </w:rPr>
+        <w:t>- Пользователи (пользователь/группа пользователей);</w:t>
+      </w:r>
+    </w:p>
+    <w:p>
+      <w:pPr>
+        <w:spacing w:after="40" w:before="0" w:line="360" w:lineRule="auto"/>
+        <w:ind w:left="567" w:hanging="227"/>
+      </w:pPr>
+      <w:r>
+        <w:rPr>
+          <w:b w:val="0"/>
+          <w:i w:val="0"/>
+          <w:lang w:val="ru-RU"/>
+        </w:rPr>
+        <w:t>- раздел учёта (необязательно);</w:t>
+      </w:r>
+    </w:p>
+    <w:p>
+      <w:pPr>
+        <w:spacing w:after="40" w:before="0" w:line="360" w:lineRule="auto"/>
+        <w:ind w:left="567" w:hanging="227"/>
+      </w:pPr>
+      <w:r>
+        <w:rPr>
+          <w:b w:val="0"/>
+          <w:i w:val="0"/>
+          <w:lang w:val="ru-RU"/>
+        </w:rPr>
+        <w:t>- число дней N;</w:t>
+      </w:r>
+    </w:p>
+    <w:p>
+      <w:pPr>
+        <w:spacing w:after="40" w:before="0" w:line="360" w:lineRule="auto"/>
+        <w:ind w:left="567" w:hanging="227"/>
+      </w:pPr>
+      <w:r>
+        <w:rPr>
+          <w:b w:val="0"/>
+          <w:i w:val="0"/>
+          <w:lang w:val="ru-RU"/>
+        </w:rPr>
+        <w:t>- признак включения.</w:t>
+      </w:r>
+    </w:p>
+    <w:p>
+      <w:pPr>
+        <w:spacing w:after="160" w:before="0" w:line="360" w:lineRule="auto"/>
+      </w:pPr>
+      <w:r>
+        <w:rPr>
+          <w:b w:val="0"/>
+          <w:i w:val="0"/>
+          <w:lang w:val="ru-RU"/>
+        </w:rPr>
+        <w:t>Пустое значение Пользователи означает «для всех пользователей».</w:t>
+      </w:r>
+    </w:p>
+    <w:p>
+      <w:pPr>
+        <w:spacing w:after="160" w:before="0" w:line="360" w:lineRule="auto"/>
+      </w:pPr>
+      <w:r>
+        <w:rPr>
+          <w:b w:val="0"/>
+          <w:i w:val="0"/>
+          <w:lang w:val="ru-RU"/>
+        </w:rPr>
+        <w:t>Пустой раздел означает все разделы учёта, где объект - организация (бухгалтерский учёт, продажи, международный учёт и аналогичные).</w:t>
+      </w:r>
+    </w:p>
+    <w:p>
+      <w:pPr>
+        <w:spacing w:after="160" w:before="0" w:line="360" w:lineRule="auto"/>
+      </w:pPr>
+      <w:r>
+        <w:rPr>
+          <w:b w:val="0"/>
+          <w:i w:val="0"/>
+          <w:lang w:val="ru-RU"/>
+        </w:rPr>
+        <w:t>При пустом разделе не заполняются:</w:t>
+      </w:r>
+    </w:p>
+    <w:p>
+      <w:pPr>
+        <w:spacing w:after="40" w:before="0" w:line="360" w:lineRule="auto"/>
+        <w:ind w:left="567" w:hanging="227"/>
+      </w:pPr>
+      <w:r>
+        <w:rPr>
+          <w:b w:val="0"/>
+          <w:i w:val="0"/>
+          <w:lang w:val="ru-RU"/>
+        </w:rPr>
+        <w:t>- касса (объект - касса);</w:t>
+      </w:r>
+    </w:p>
+    <w:p>
+      <w:pPr>
+        <w:spacing w:after="40" w:before="0" w:line="360" w:lineRule="auto"/>
+        <w:ind w:left="567" w:hanging="227"/>
+      </w:pPr>
+      <w:r>
+        <w:rPr>
+          <w:b w:val="0"/>
+          <w:i w:val="0"/>
+          <w:lang w:val="ru-RU"/>
+        </w:rPr>
+        <w:t>- склады (объект - склад);</w:t>
+      </w:r>
+    </w:p>
+    <w:p>
+      <w:pPr>
+        <w:spacing w:after="40" w:before="0" w:line="360" w:lineRule="auto"/>
+        <w:ind w:left="567" w:hanging="227"/>
+      </w:pPr>
+      <w:r>
+        <w:rPr>
+          <w:b w:val="0"/>
+          <w:i w:val="0"/>
+          <w:lang w:val="ru-RU"/>
+        </w:rPr>
+        <w:t>- сценарии бюджетирования (объект - сценарий);</w:t>
+      </w:r>
+    </w:p>
+    <w:p>
+      <w:pPr>
+        <w:spacing w:after="40" w:before="0" w:line="360" w:lineRule="auto"/>
+        <w:ind w:left="567" w:hanging="227"/>
+      </w:pPr>
+      <w:r>
+        <w:rPr>
+          <w:b w:val="0"/>
+          <w:i w:val="0"/>
+          <w:lang w:val="ru-RU"/>
+        </w:rPr>
+        <w:t>- банковские счета (объект - банковский счёт).</w:t>
+      </w:r>
+    </w:p>
+    <w:p>
+      <w:pPr>
+        <w:spacing w:after="160" w:before="0" w:line="360" w:lineRule="auto"/>
+      </w:pPr>
+      <w:r>
+        <w:rPr>
+          <w:b w:val="0"/>
+          <w:i w:val="0"/>
+          <w:lang w:val="ru-RU"/>
+        </w:rPr>
+        <w:t>У этих разделов даты в типовой форме живут отдельно и этой доработкой не перезаписываются.</w:t>
+      </w:r>
+    </w:p>
+    <w:p>
+      <w:pPr>
+        <w:spacing w:after="160" w:before="0" w:line="360" w:lineRule="auto"/>
+      </w:pPr>
+      <w:r>
+        <w:rPr>
+          <w:b w:val="0"/>
+          <w:i w:val="0"/>
+          <w:lang w:val="ru-RU"/>
+        </w:rPr>
+        <w:t>Регламентное задание нп_СдвигДатЗапретаИзменения записывает в типовой регистр ДатыЗапретаИзменения абсолютную дату: начало дня текущей даты сеанса минус N дней настройки.</w:t>
+      </w:r>
+    </w:p>
+    <w:p>
+      <w:pPr>
+        <w:spacing w:after="160" w:before="0" w:line="360" w:lineRule="auto"/>
+      </w:pPr>
+      <w:r>
+        <w:rPr>
+          <w:b w:val="0"/>
+          <w:i w:val="0"/>
+          <w:lang w:val="ru-RU"/>
+        </w:rPr>
+        <w:t>Для одной организации допускается несколько настроек с разным N:</w:t>
+      </w:r>
+    </w:p>
+    <w:p>
+      <w:pPr>
+        <w:spacing w:after="40" w:before="0" w:line="360" w:lineRule="auto"/>
+        <w:ind w:left="567" w:hanging="227"/>
+      </w:pPr>
+      <w:r>
+        <w:rPr>
+          <w:b w:val="0"/>
+          <w:i w:val="0"/>
+          <w:lang w:val="ru-RU"/>
+        </w:rPr>
+        <w:t>- по Пользователям (пользователь/группа пользователей);</w:t>
+      </w:r>
+    </w:p>
+    <w:p>
+      <w:pPr>
+        <w:spacing w:after="40" w:before="0" w:line="360" w:lineRule="auto"/>
+        <w:ind w:left="567" w:hanging="227"/>
+      </w:pPr>
+      <w:r>
+        <w:rPr>
+          <w:b w:val="0"/>
+          <w:i w:val="0"/>
+          <w:lang w:val="ru-RU"/>
+        </w:rPr>
+        <w:t>- при необходимости - по разделу учёта.</w:t>
+      </w:r>
+    </w:p>
+    <w:p>
+      <w:pPr>
+        <w:spacing w:after="160" w:before="0" w:line="360" w:lineRule="auto"/>
+      </w:pPr>
+      <w:r>
+        <w:rPr>
+          <w:b w:val="0"/>
+          <w:i w:val="0"/>
+          <w:lang w:val="ru-RU"/>
+        </w:rPr>
+        <w:t>Изменяются только записи, которые есть в настройках. Даты, заданные только в типовой форме, не перезаписываются.</w:t>
+      </w:r>
+    </w:p>
+    <w:p>
+      <w:pPr>
+        <w:pStyle w:val="31"/>
+        <w:spacing w:after="80" w:before="200" w:line="360" w:lineRule="auto"/>
+      </w:pPr>
+      <w:r>
+        <w:rPr>
+          <w:lang w:val="ru-RU"/>
+        </w:rPr>
+        <w:t>2.2. Заявка на открытие периода</w:t>
+      </w:r>
+    </w:p>
+    <w:p>
+      <w:pPr>
+        <w:spacing w:after="160" w:before="0" w:line="360" w:lineRule="auto"/>
+      </w:pPr>
+      <w:r>
+        <w:rPr>
+          <w:b w:val="0"/>
+          <w:i w:val="0"/>
+          <w:lang w:val="ru-RU"/>
+        </w:rPr>
+        <w:t>Документ нп_ЗаявкаНаОткрытиеПериода содержит:</w:t>
+      </w:r>
+    </w:p>
+    <w:p>
+      <w:pPr>
+        <w:spacing w:after="40" w:before="0" w:line="360" w:lineRule="auto"/>
+        <w:ind w:left="567" w:hanging="227"/>
+      </w:pPr>
+      <w:r>
+        <w:rPr>
+          <w:b w:val="0"/>
+          <w:i w:val="0"/>
+          <w:lang w:val="ru-RU"/>
+        </w:rPr>
+        <w:t>- организации;</w:t>
+      </w:r>
+    </w:p>
+    <w:p>
+      <w:pPr>
+        <w:spacing w:after="40" w:before="0" w:line="360" w:lineRule="auto"/>
+        <w:ind w:left="567" w:hanging="227"/>
+      </w:pPr>
+      <w:r>
+        <w:rPr>
+          <w:b w:val="0"/>
+          <w:i w:val="0"/>
+          <w:lang w:val="ru-RU"/>
+        </w:rPr>
+        <w:t>- срок действия открытого периода в днях (K);</w:t>
+      </w:r>
+    </w:p>
+    <w:p>
+      <w:pPr>
+        <w:spacing w:after="40" w:before="0" w:line="360" w:lineRule="auto"/>
+        <w:ind w:left="567" w:hanging="227"/>
+      </w:pPr>
+      <w:r>
+        <w:rPr>
+          <w:b w:val="0"/>
+          <w:i w:val="0"/>
+          <w:lang w:val="ru-RU"/>
+        </w:rPr>
+        <w:t>- период «с» и «по»;</w:t>
+      </w:r>
+    </w:p>
+    <w:p>
+      <w:pPr>
+        <w:spacing w:after="40" w:before="0" w:line="360" w:lineRule="auto"/>
+        <w:ind w:left="567" w:hanging="227"/>
+      </w:pPr>
+      <w:r>
+        <w:rPr>
+          <w:b w:val="0"/>
+          <w:i w:val="0"/>
+          <w:lang w:val="ru-RU"/>
+        </w:rPr>
+        <w:t>- раздел учёта (необязательно).</w:t>
+      </w:r>
+    </w:p>
+    <w:p>
+      <w:pPr>
+        <w:spacing w:after="160" w:before="0" w:line="360" w:lineRule="auto"/>
+      </w:pPr>
+      <w:r>
+        <w:rPr>
+          <w:b w:val="0"/>
+          <w:i w:val="0"/>
+          <w:lang w:val="ru-RU"/>
+        </w:rPr>
+        <w:t>Согласование выполняется штатными средствами бесшовной интеграции с 1С:Документооборот 3.</w:t>
+      </w:r>
+    </w:p>
+    <w:p>
+      <w:pPr>
+        <w:spacing w:after="160" w:before="0" w:line="360" w:lineRule="auto"/>
+      </w:pPr>
+      <w:r>
+        <w:rPr>
+          <w:b w:val="0"/>
+          <w:i w:val="0"/>
+          <w:lang w:val="ru-RU"/>
+        </w:rPr>
+        <w:t>Пока заявка не согласована, типовой регистр не изменяется.</w:t>
+      </w:r>
+    </w:p>
+    <w:p>
+      <w:pPr>
+        <w:spacing w:after="160" w:before="0" w:line="360" w:lineRule="auto"/>
+      </w:pPr>
+      <w:r>
+        <w:rPr>
+          <w:b w:val="0"/>
+          <w:i w:val="0"/>
+          <w:lang w:val="ru-RU"/>
+        </w:rPr>
+        <w:t>После состояния «Согласован»:</w:t>
+      </w:r>
+    </w:p>
+    <w:p>
+      <w:pPr>
+        <w:spacing w:after="40" w:before="0" w:line="360" w:lineRule="auto"/>
+        <w:ind w:left="567" w:hanging="227"/>
+      </w:pPr>
+      <w:r>
+        <w:rPr>
+          <w:b w:val="0"/>
+          <w:i w:val="0"/>
+          <w:lang w:val="ru-RU"/>
+        </w:rPr>
+        <w:t>- срок действия открытого периода отсчитывается от даты согласования (день согласования - день 1);</w:t>
+      </w:r>
+    </w:p>
+    <w:p>
+      <w:pPr>
+        <w:spacing w:after="40" w:before="0" w:line="360" w:lineRule="auto"/>
+        <w:ind w:left="567" w:hanging="227"/>
+      </w:pPr>
+      <w:r>
+        <w:rPr>
+          <w:b w:val="0"/>
+          <w:i w:val="0"/>
+          <w:lang w:val="ru-RU"/>
+        </w:rPr>
+        <w:t>- в типовой регистр записывается отсечка «Период с минус 1 день» по организациям, разделу и Пользователям из настроек автоматической установки;</w:t>
+      </w:r>
+    </w:p>
+    <w:p>
+      <w:pPr>
+        <w:spacing w:after="40" w:before="0" w:line="360" w:lineRule="auto"/>
+        <w:ind w:left="567" w:hanging="227"/>
+      </w:pPr>
+      <w:r>
+        <w:rPr>
+          <w:b w:val="0"/>
+          <w:i w:val="0"/>
+          <w:lang w:val="ru-RU"/>
+        </w:rPr>
+        <w:t>- если настроек по организации нет, записывается «для всех пользователей».</w:t>
+      </w:r>
+    </w:p>
+    <w:p>
+      <w:pPr>
+        <w:spacing w:after="160" w:before="0" w:line="360" w:lineRule="auto"/>
+      </w:pPr>
+      <w:r>
+        <w:rPr>
+          <w:b w:val="0"/>
+          <w:i w:val="0"/>
+          <w:lang w:val="ru-RU"/>
+        </w:rPr>
+        <w:t>Пока срок действия открытого периода не истёк, автоматическая установка эти записи не перезаписывает.</w:t>
+      </w:r>
+    </w:p>
+    <w:p>
+      <w:pPr>
+        <w:spacing w:after="160" w:before="0" w:line="360" w:lineRule="auto"/>
+      </w:pPr>
+      <w:r>
+        <w:rPr>
+          <w:b w:val="0"/>
+          <w:i w:val="0"/>
+          <w:lang w:val="ru-RU"/>
+        </w:rPr>
+        <w:t>После истечения срока при включённой автоматической установке восстанавливается своё «сегодня минус N» каждой настройки.</w:t>
+      </w:r>
+    </w:p>
+    <w:p>
+      <w:pPr>
+        <w:spacing w:after="160" w:before="0" w:line="360" w:lineRule="auto"/>
+      </w:pPr>
+      <w:r>
+        <w:rPr>
+          <w:b w:val="0"/>
+          <w:i w:val="0"/>
+          <w:lang w:val="ru-RU"/>
+        </w:rPr>
+        <w:t>На форме заявки нужно пояснение: отсечка БСП откроет всё после даты «Период с минус 1 день», а не только выбранный месяц.</w:t>
+      </w:r>
+    </w:p>
+    <w:p>
+      <w:pPr>
+        <w:pStyle w:val="31"/>
+        <w:spacing w:after="80" w:before="200" w:line="360" w:lineRule="auto"/>
+      </w:pPr>
+      <w:r>
+        <w:rPr>
+          <w:lang w:val="ru-RU"/>
+        </w:rPr>
+        <w:t>2.3. Не входит в заявку</w:t>
+      </w:r>
+    </w:p>
+    <w:p>
+      <w:pPr>
+        <w:spacing w:after="160" w:before="0" w:line="360" w:lineRule="auto"/>
+      </w:pPr>
+      <w:r>
+        <w:rPr>
+          <w:b w:val="0"/>
+          <w:i w:val="0"/>
+          <w:lang w:val="ru-RU"/>
+        </w:rPr>
+        <w:t>Постоянно:</w:t>
+      </w:r>
+    </w:p>
+    <w:p>
+      <w:pPr>
+        <w:spacing w:after="40" w:before="0" w:line="360" w:lineRule="auto"/>
+        <w:ind w:left="567" w:hanging="227"/>
+      </w:pPr>
+      <w:r>
+        <w:rPr>
+          <w:b w:val="0"/>
+          <w:i w:val="0"/>
+          <w:lang w:val="ru-RU"/>
+        </w:rPr>
+        <w:t>1. Изменение типовых подписок и модулей проверки даты запрета.</w:t>
+      </w:r>
+    </w:p>
+    <w:p>
+      <w:pPr>
+        <w:spacing w:after="40" w:before="0" w:line="360" w:lineRule="auto"/>
+        <w:ind w:left="567" w:hanging="227"/>
+      </w:pPr>
+      <w:r>
+        <w:rPr>
+          <w:b w:val="0"/>
+          <w:i w:val="0"/>
+          <w:lang w:val="ru-RU"/>
+        </w:rPr>
+        <w:t>2. Новый относительный вариант БСП вида «прошло N дней».</w:t>
+      </w:r>
+    </w:p>
+    <w:p>
+      <w:pPr>
+        <w:spacing w:after="40" w:before="0" w:line="360" w:lineRule="auto"/>
+        <w:ind w:left="567" w:hanging="227"/>
+      </w:pPr>
+      <w:r>
+        <w:rPr>
+          <w:b w:val="0"/>
+          <w:i w:val="0"/>
+          <w:lang w:val="ru-RU"/>
+        </w:rPr>
+        <w:t>3. Открытие только середины закрытого диапазона.</w:t>
+      </w:r>
+    </w:p>
+    <w:p>
+      <w:pPr>
+        <w:spacing w:after="40" w:before="0" w:line="360" w:lineRule="auto"/>
+        <w:ind w:left="567" w:hanging="227"/>
+      </w:pPr>
+      <w:r>
+        <w:rPr>
+          <w:b w:val="0"/>
+          <w:i w:val="0"/>
+          <w:lang w:val="ru-RU"/>
+        </w:rPr>
+        <w:t>4. Правки форм расширения ТН.</w:t>
+      </w:r>
+    </w:p>
+    <w:p>
+      <w:pPr>
+        <w:spacing w:after="160" w:before="0" w:line="360" w:lineRule="auto"/>
+      </w:pPr>
+      <w:r>
+        <w:rPr>
+          <w:b w:val="0"/>
+          <w:i w:val="0"/>
+          <w:lang w:val="ru-RU"/>
+        </w:rPr>
+        <w:t>Отложено (возможен возврат отдельной заявкой):</w:t>
+      </w:r>
+    </w:p>
+    <w:p>
+      <w:pPr>
+        <w:spacing w:after="40" w:before="0" w:line="360" w:lineRule="auto"/>
+        <w:ind w:left="567" w:hanging="227"/>
+      </w:pPr>
+      <w:r>
+        <w:rPr>
+          <w:b w:val="0"/>
+          <w:i w:val="0"/>
+          <w:lang w:val="ru-RU"/>
+        </w:rPr>
+        <w:t>1. Форма бухгалтера без прав на весь типовой регистр.</w:t>
+      </w:r>
+    </w:p>
+    <w:p>
+      <w:pPr>
+        <w:spacing w:after="40" w:before="0" w:line="360" w:lineRule="auto"/>
+        <w:ind w:left="567" w:hanging="227"/>
+      </w:pPr>
+      <w:r>
+        <w:rPr>
+          <w:b w:val="0"/>
+          <w:i w:val="0"/>
+          <w:lang w:val="ru-RU"/>
+        </w:rPr>
+        <w:t>2. Массовая загрузка из Excel.</w:t>
+      </w:r>
+    </w:p>
+    <w:p>
+      <w:pPr>
         <w:pStyle w:val="21"/>
-        <w:spacing w:after="0" w:line="360" w:lineRule="auto" w:before="0"/>
+        <w:spacing w:after="120" w:before="240" w:line="360" w:lineRule="auto"/>
       </w:pPr>
       <w:r>
         <w:rPr>
@@ -241,7 +872,7 @@
     </w:p>
     <w:p>
       <w:pPr>
-        <w:spacing w:after="0" w:line="360" w:lineRule="auto"/>
+        <w:spacing w:after="160" w:before="0" w:line="360" w:lineRule="auto"/>
       </w:pPr>
       <w:r>
         <w:rPr>
@@ -262,7 +893,7 @@
     </w:p>
     <w:p>
       <w:pPr>
-        <w:spacing w:after="0" w:line="360" w:lineRule="auto"/>
+        <w:spacing w:after="160" w:before="0" w:line="360" w:lineRule="auto"/>
       </w:pPr>
       <w:r>
         <w:rPr>
@@ -270,13 +901,69 @@
           <w:i w:val="0"/>
           <w:lang w:val="ru-RU"/>
         </w:rPr>
-        <w:t>Ночью абсолютная дата запрета сама сдвигается на один день при неизменном N. Разные N могут действовать для разных Пользователей (пользователь/группа пользователей) и разделов учёта одной организации. Согласованная заявка временно открывает период на K дней, затем граница возвращается к автоматической установке. Типовая проверка периода при записи документов и справочников не меняется.</w:t>
+        <w:t>Ожидаемый результат:</w:t>
       </w:r>
     </w:p>
     <w:p>
       <w:pPr>
+        <w:spacing w:after="40" w:before="0" w:line="360" w:lineRule="auto"/>
+        <w:ind w:left="567" w:hanging="227"/>
+      </w:pPr>
+      <w:r>
+        <w:rPr>
+          <w:b w:val="0"/>
+          <w:i w:val="0"/>
+          <w:lang w:val="ru-RU"/>
+        </w:rPr>
+        <w:t>1. Ночью абсолютная дата запрета сама сдвигается на один день при неизменном N.</w:t>
+      </w:r>
+    </w:p>
+    <w:p>
+      <w:pPr>
+        <w:spacing w:after="40" w:before="0" w:line="360" w:lineRule="auto"/>
+        <w:ind w:left="567" w:hanging="227"/>
+      </w:pPr>
+      <w:r>
+        <w:rPr>
+          <w:b w:val="0"/>
+          <w:i w:val="0"/>
+          <w:lang w:val="ru-RU"/>
+        </w:rPr>
+        <w:t>2. Разные N могут действовать для разных Пользователей (пользователь/группа пользователей) и разделов учёта одной организации.</w:t>
+      </w:r>
+    </w:p>
+    <w:p>
+      <w:pPr>
+        <w:spacing w:after="40" w:before="0" w:line="360" w:lineRule="auto"/>
+        <w:ind w:left="567" w:hanging="227"/>
+      </w:pPr>
+      <w:r>
+        <w:rPr>
+          <w:b w:val="0"/>
+          <w:i w:val="0"/>
+          <w:lang w:val="ru-RU"/>
+        </w:rPr>
+        <w:t>3. Согласованная заявка временно открывает период на K дней, затем граница возвращается к автоматической установке.</w:t>
+      </w:r>
+    </w:p>
+    <w:p>
+      <w:pPr>
+        <w:spacing w:after="40" w:before="0" w:line="360" w:lineRule="auto"/>
+        <w:ind w:left="567" w:hanging="227"/>
+      </w:pPr>
+      <w:r>
+        <w:rPr>
+          <w:b w:val="0"/>
+          <w:i w:val="0"/>
+          <w:lang w:val="ru-RU"/>
+        </w:rPr>
+        <w:t>4. Типовая проверка периода при записи документов и справочников не меняется.</w:t>
+      </w:r>
+    </w:p>
+    <w:p>
+      <w:pPr>
         <w:pStyle w:val="21"/>
-        <w:spacing w:after="0" w:line="360" w:lineRule="auto" w:before="0"/>
+        <w:spacing w:after="120" w:before="240" w:line="360" w:lineRule="auto"/>
       </w:pPr>
       <w:r>
         <w:rPr>
@@ -287,7 +974,7 @@
     </w:p>
     <w:p>
       <w:pPr>
-        <w:spacing w:after="0" w:line="360" w:lineRule="auto"/>
+        <w:spacing w:after="160" w:before="0" w:line="360" w:lineRule="auto"/>
       </w:pPr>
       <w:r>
         <w:rPr>
@@ -308,7 +995,7 @@
     </w:p>
     <w:p>
       <w:pPr>
-        <w:spacing w:after="0" w:line="360" w:lineRule="auto"/>
+        <w:spacing w:after="160" w:before="0" w:line="360" w:lineRule="auto"/>
       </w:pPr>
       <w:r>
         <w:rPr>
@@ -329,7 +1016,7 @@
     </w:p>
     <w:p>
       <w:pPr>
-        <w:spacing w:after="0" w:line="360" w:lineRule="auto"/>
+        <w:spacing w:after="160" w:before="0" w:line="360" w:lineRule="auto"/>
       </w:pPr>
       <w:r>
         <w:rPr>
@@ -350,7 +1037,7 @@
     </w:p>
     <w:p>
       <w:pPr>
-        <w:spacing w:after="0" w:line="360" w:lineRule="auto"/>
+        <w:spacing w:after="160" w:before="0" w:line="360" w:lineRule="auto"/>
       </w:pPr>
       <w:r>
         <w:rPr>
@@ -363,7 +1050,8 @@
     </w:p>
     <w:p>
       <w:pPr>
-        <w:spacing w:after="0" w:line="360" w:lineRule="auto"/>
+        <w:spacing w:after="40" w:before="0" w:line="360" w:lineRule="auto"/>
+        <w:ind w:left="567" w:hanging="227"/>
       </w:pPr>
       <w:r>
         <w:rPr>
@@ -376,7 +1064,8 @@
     </w:p>
     <w:p>
       <w:pPr>
-        <w:spacing w:after="0" w:line="360" w:lineRule="auto"/>
+        <w:spacing w:after="40" w:before="0" w:line="360" w:lineRule="auto"/>
+        <w:ind w:left="567" w:hanging="227"/>
       </w:pPr>
       <w:r>
         <w:rPr>
@@ -389,7 +1078,8 @@
     </w:p>
     <w:p>
       <w:pPr>
-        <w:spacing w:after="0" w:line="360" w:lineRule="auto"/>
+        <w:spacing w:after="40" w:before="0" w:line="360" w:lineRule="auto"/>
+        <w:ind w:left="567" w:hanging="227"/>
       </w:pPr>
       <w:r>
         <w:rPr>
@@ -402,7 +1092,8 @@
     </w:p>
     <w:p>
       <w:pPr>
-        <w:spacing w:after="0" w:line="360" w:lineRule="auto"/>
+        <w:spacing w:after="40" w:before="0" w:line="360" w:lineRule="auto"/>
+        <w:ind w:left="567" w:hanging="227"/>
       </w:pPr>
       <w:r>
         <w:rPr>
@@ -415,7 +1106,7 @@
     </w:p>
     <w:p>
       <w:pPr>
-        <w:spacing w:after="0" w:line="360" w:lineRule="auto"/>
+        <w:spacing w:after="160" w:before="0" w:line="360" w:lineRule="auto"/>
       </w:pPr>
       <w:r>
         <w:rPr>
@@ -425,18 +1116,49 @@
         </w:rPr>
         <w:t>Какие объекты конфигурации затронуты, влияние на другие подсистемы:</w:t>
       </w:r>
+    </w:p>
+    <w:p>
+      <w:pPr>
+        <w:spacing w:after="160" w:before="0" w:line="360" w:lineRule="auto"/>
+      </w:pPr>
       <w:r>
         <w:rPr>
           <w:b w:val="0"/>
           <w:i w:val="0"/>
           <w:lang w:val="ru-RU"/>
         </w:rPr>
-        <w:t xml:space="preserve"> расширение НП (новые объекты с префиксом нп_). Типовой регистр ДатыЗапретаИзменения - только запись абсолютных дат по правилам заявки. Расширение ТН не затрагивается.</w:t>
+        <w:t>Расширение НП (новые объекты с префиксом нп_).</w:t>
       </w:r>
     </w:p>
     <w:p>
       <w:pPr>
-        <w:spacing w:after="0" w:line="360" w:lineRule="auto"/>
+        <w:spacing w:after="160" w:before="0" w:line="360" w:lineRule="auto"/>
+      </w:pPr>
+      <w:r>
+        <w:rPr>
+          <w:b w:val="0"/>
+          <w:i w:val="0"/>
+          <w:lang w:val="ru-RU"/>
+        </w:rPr>
+        <w:t>Типовой регистр ДатыЗапретаИзменения - только запись абсолютных дат по правилам заявки.</w:t>
+      </w:r>
+    </w:p>
+    <w:p>
+      <w:pPr>
+        <w:spacing w:after="160" w:before="0" w:line="360" w:lineRule="auto"/>
+      </w:pPr>
+      <w:r>
+        <w:rPr>
+          <w:b w:val="0"/>
+          <w:i w:val="0"/>
+          <w:lang w:val="ru-RU"/>
+        </w:rPr>
+        <w:t>Расширение ТН не затрагивается.</w:t>
+      </w:r>
+    </w:p>
+    <w:p>
+      <w:pPr>
+        <w:spacing w:after="160" w:before="0" w:line="360" w:lineRule="auto"/>
       </w:pPr>
       <w:r>
         <w:rPr>
@@ -446,13 +1168,44 @@
         </w:rPr>
         <w:t>Инструкция для пользователя:</w:t>
       </w:r>
+    </w:p>
+    <w:p>
+      <w:pPr>
+        <w:spacing w:after="160" w:before="0" w:line="360" w:lineRule="auto"/>
+      </w:pPr>
       <w:r>
         <w:rPr>
           <w:b w:val="0"/>
           <w:i w:val="0"/>
           <w:lang w:val="ru-RU"/>
         </w:rPr>
-        <w:t xml:space="preserve"> Администратор дат запрета заполняет нп_НастройкиАвтоматическойУстановкиДатЗапрета. Пользователь создаёт нп_ЗаявкаНаОткрытиеПериода и отправляет на согласование в 1С:Документооборот 3. Подробные правила, алгоритмы и критерии приёмки - в техническом задании к заявке ERP.2026.14.</w:t>
+        <w:t>Администратор дат запрета заполняет нп_НастройкиАвтоматическойУстановкиДатЗапрета.</w:t>
+      </w:r>
+    </w:p>
+    <w:p>
+      <w:pPr>
+        <w:spacing w:after="160" w:before="0" w:line="360" w:lineRule="auto"/>
+      </w:pPr>
+      <w:r>
+        <w:rPr>
+          <w:b w:val="0"/>
+          <w:i w:val="0"/>
+          <w:lang w:val="ru-RU"/>
+        </w:rPr>
+        <w:t>Пользователь создаёт нп_ЗаявкаНаОткрытиеПериода и отправляет на согласование в 1С:Документооборот 3.</w:t>
+      </w:r>
+    </w:p>
+    <w:p>
+      <w:pPr>
+        <w:spacing w:after="160" w:before="0" w:line="360" w:lineRule="auto"/>
+      </w:pPr>
+      <w:r>
+        <w:rPr>
+          <w:b w:val="0"/>
+          <w:i w:val="0"/>
+          <w:lang w:val="ru-RU"/>
+        </w:rPr>
+        <w:t>Подробные правила, алгоритмы и критерии приёмки - в техническом задании к заявке ERP.2026.14.</w:t>
       </w:r>
     </w:p>
     <w:sectPr>

</xml_diff>